<commit_message>
Add plain-English guide, 4 user roles, and 9-step application workflow to Word and Markdown docs
</commit_message>
<xml_diff>
--- a/docs/ChronicAI-Full-System-Documentation.docx
+++ b/docs/ChronicAI-Full-System-Documentation.docx
@@ -119,7 +119,553 @@
         <w:pStyle w:val="Heading1"/>
       </w:pPr>
       <w:r>
-        <w:t>2. Complete Project Directory Structure</w:t>
+        <w:t>2. Plain-English Guide &amp; Application Workflow</w:t>
+      </w:r>
+    </w:p>
+    <w:p>
+      <w:pPr>
+        <w:spacing w:line="276" w:lineRule="auto"/>
+      </w:pPr>
+      <w:r>
+        <w:t>In simple terms, ChronicAI is an intelligent emergency management network—similar to 911 combined with Uber and AI. When an embankment collapses, a road washes out, or floodwaters trap citizens, ChronicAI connects the person on the ground directly to the emergency director's screen and dispatches the closest rescue squad automatically.</w:t>
+        <w:br/>
+      </w:r>
+    </w:p>
+    <w:p>
+      <w:pPr>
+        <w:pStyle w:val="Heading2"/>
+      </w:pPr>
+      <w:r>
+        <w:t>2.1 The 4 Key User Roles</w:t>
+      </w:r>
+    </w:p>
+    <w:tbl>
+      <w:tblPr>
+        <w:tblW w:type="auto" w:w="0"/>
+        <w:jc w:val="center"/>
+        <w:tblLook w:firstColumn="1" w:firstRow="1" w:lastColumn="0" w:lastRow="0" w:noHBand="0" w:noVBand="1" w:val="04A0"/>
+      </w:tblPr>
+      <w:tblGrid>
+        <w:gridCol w:w="3120"/>
+        <w:gridCol w:w="3120"/>
+        <w:gridCol w:w="3120"/>
+      </w:tblGrid>
+      <w:tr>
+        <w:tc>
+          <w:tcPr>
+            <w:tcW w:type="dxa" w:w="2160"/>
+            <w:shd w:val="clear" w:color="auto" w:fill="091A2D"/>
+            <w:tcMar>
+              <w:top w:w="120" w:type="dxa"/>
+              <w:bottom w:w="120" w:type="dxa"/>
+              <w:left w:w="140" w:type="dxa"/>
+              <w:right w:w="140" w:type="dxa"/>
+            </w:tcMar>
+          </w:tcPr>
+          <w:p>
+            <w:pPr>
+              <w:jc w:val="left"/>
+            </w:pPr>
+            <w:r>
+              <w:rPr>
+                <w:rFonts w:ascii="Segoe UI" w:hAnsi="Segoe UI"/>
+                <w:b/>
+                <w:color w:val="FFFFFF"/>
+                <w:sz w:val="19"/>
+              </w:rPr>
+              <w:t>User Role</w:t>
+            </w:r>
+          </w:p>
+        </w:tc>
+        <w:tc>
+          <w:tcPr>
+            <w:tcW w:type="dxa" w:w="2880"/>
+            <w:shd w:val="clear" w:color="auto" w:fill="091A2D"/>
+            <w:tcMar>
+              <w:top w:w="120" w:type="dxa"/>
+              <w:bottom w:w="120" w:type="dxa"/>
+              <w:left w:w="140" w:type="dxa"/>
+              <w:right w:w="140" w:type="dxa"/>
+            </w:tcMar>
+          </w:tcPr>
+          <w:p>
+            <w:pPr>
+              <w:jc w:val="left"/>
+            </w:pPr>
+            <w:r>
+              <w:rPr>
+                <w:rFonts w:ascii="Segoe UI" w:hAnsi="Segoe UI"/>
+                <w:b/>
+                <w:color w:val="FFFFFF"/>
+                <w:sz w:val="19"/>
+              </w:rPr>
+              <w:t>Pages Used</w:t>
+            </w:r>
+          </w:p>
+        </w:tc>
+        <w:tc>
+          <w:tcPr>
+            <w:tcW w:type="dxa" w:w="4320"/>
+            <w:shd w:val="clear" w:color="auto" w:fill="091A2D"/>
+            <w:tcMar>
+              <w:top w:w="120" w:type="dxa"/>
+              <w:bottom w:w="120" w:type="dxa"/>
+              <w:left w:w="140" w:type="dxa"/>
+              <w:right w:w="140" w:type="dxa"/>
+            </w:tcMar>
+          </w:tcPr>
+          <w:p>
+            <w:pPr>
+              <w:jc w:val="left"/>
+            </w:pPr>
+            <w:r>
+              <w:rPr>
+                <w:rFonts w:ascii="Segoe UI" w:hAnsi="Segoe UI"/>
+                <w:b/>
+                <w:color w:val="FFFFFF"/>
+                <w:sz w:val="19"/>
+              </w:rPr>
+              <w:t>Key Responsibilities</w:t>
+            </w:r>
+          </w:p>
+        </w:tc>
+      </w:tr>
+      <w:tr>
+        <w:tc>
+          <w:tcPr>
+            <w:tcW w:type="dxa" w:w="2160"/>
+            <w:shd w:val="clear" w:color="auto" w:fill="FFFFFF"/>
+            <w:tcMar>
+              <w:top w:w="100" w:type="dxa"/>
+              <w:bottom w:w="100" w:type="dxa"/>
+              <w:left w:w="140" w:type="dxa"/>
+              <w:right w:w="140" w:type="dxa"/>
+            </w:tcMar>
+          </w:tcPr>
+          <w:p>
+            <w:r>
+              <w:rPr>
+                <w:rFonts w:ascii="Segoe UI" w:hAnsi="Segoe UI"/>
+                <w:b/>
+                <w:color w:val="1E293B"/>
+                <w:sz w:val="18"/>
+              </w:rPr>
+              <w:t>1. Everyday Citizen</w:t>
+            </w:r>
+          </w:p>
+        </w:tc>
+        <w:tc>
+          <w:tcPr>
+            <w:tcW w:type="dxa" w:w="2880"/>
+            <w:shd w:val="clear" w:color="auto" w:fill="FFFFFF"/>
+            <w:tcMar>
+              <w:top w:w="100" w:type="dxa"/>
+              <w:bottom w:w="100" w:type="dxa"/>
+              <w:left w:w="140" w:type="dxa"/>
+              <w:right w:w="140" w:type="dxa"/>
+            </w:tcMar>
+          </w:tcPr>
+          <w:p>
+            <w:r>
+              <w:rPr>
+                <w:rFonts w:ascii="Segoe UI" w:hAnsi="Segoe UI"/>
+                <w:color w:val="1E293B"/>
+                <w:sz w:val="18"/>
+              </w:rPr>
+              <w:t>report-problem.html, track.html, request.html</w:t>
+            </w:r>
+          </w:p>
+        </w:tc>
+        <w:tc>
+          <w:tcPr>
+            <w:tcW w:type="dxa" w:w="4320"/>
+            <w:shd w:val="clear" w:color="auto" w:fill="FFFFFF"/>
+            <w:tcMar>
+              <w:top w:w="100" w:type="dxa"/>
+              <w:bottom w:w="100" w:type="dxa"/>
+              <w:left w:w="140" w:type="dxa"/>
+              <w:right w:w="140" w:type="dxa"/>
+            </w:tcMar>
+          </w:tcPr>
+          <w:p>
+            <w:r>
+              <w:rPr>
+                <w:rFonts w:ascii="Segoe UI" w:hAnsi="Segoe UI"/>
+                <w:color w:val="1E293B"/>
+                <w:sz w:val="18"/>
+              </w:rPr>
+              <w:t>Takes photos of hazards, tags GPS coordinates, requests emergency boat/water aid, and tracks resolution.</w:t>
+            </w:r>
+          </w:p>
+        </w:tc>
+      </w:tr>
+      <w:tr>
+        <w:tc>
+          <w:tcPr>
+            <w:tcW w:type="dxa" w:w="2160"/>
+            <w:shd w:val="clear" w:color="auto" w:fill="F8FAFC"/>
+            <w:tcMar>
+              <w:top w:w="100" w:type="dxa"/>
+              <w:bottom w:w="100" w:type="dxa"/>
+              <w:left w:w="140" w:type="dxa"/>
+              <w:right w:w="140" w:type="dxa"/>
+            </w:tcMar>
+          </w:tcPr>
+          <w:p>
+            <w:r>
+              <w:rPr>
+                <w:rFonts w:ascii="Segoe UI" w:hAnsi="Segoe UI"/>
+                <w:b/>
+                <w:color w:val="1E293B"/>
+                <w:sz w:val="18"/>
+              </w:rPr>
+              <w:t>2. Emergency Officer</w:t>
+            </w:r>
+          </w:p>
+        </w:tc>
+        <w:tc>
+          <w:tcPr>
+            <w:tcW w:type="dxa" w:w="2880"/>
+            <w:shd w:val="clear" w:color="auto" w:fill="F8FAFC"/>
+            <w:tcMar>
+              <w:top w:w="100" w:type="dxa"/>
+              <w:bottom w:w="100" w:type="dxa"/>
+              <w:left w:w="140" w:type="dxa"/>
+              <w:right w:w="140" w:type="dxa"/>
+            </w:tcMar>
+          </w:tcPr>
+          <w:p>
+            <w:r>
+              <w:rPr>
+                <w:rFonts w:ascii="Segoe UI" w:hAnsi="Segoe UI"/>
+                <w:color w:val="1E293B"/>
+                <w:sz w:val="18"/>
+              </w:rPr>
+              <w:t>admin-login.html, admin-dashboard.html</w:t>
+            </w:r>
+          </w:p>
+        </w:tc>
+        <w:tc>
+          <w:tcPr>
+            <w:tcW w:type="dxa" w:w="4320"/>
+            <w:shd w:val="clear" w:color="auto" w:fill="F8FAFC"/>
+            <w:tcMar>
+              <w:top w:w="100" w:type="dxa"/>
+              <w:bottom w:w="100" w:type="dxa"/>
+              <w:left w:w="140" w:type="dxa"/>
+              <w:right w:w="140" w:type="dxa"/>
+            </w:tcMar>
+          </w:tcPr>
+          <w:p>
+            <w:r>
+              <w:rPr>
+                <w:rFonts w:ascii="Segoe UI" w:hAnsi="Segoe UI"/>
+                <w:color w:val="1E293B"/>
+                <w:sz w:val="18"/>
+              </w:rPr>
+              <w:t>Logs in with 2FA email OTP, verifies incident urgency, reviews AI severity, and dispatches rescue assets.</w:t>
+            </w:r>
+          </w:p>
+        </w:tc>
+      </w:tr>
+      <w:tr>
+        <w:tc>
+          <w:tcPr>
+            <w:tcW w:type="dxa" w:w="2160"/>
+            <w:shd w:val="clear" w:color="auto" w:fill="FFFFFF"/>
+            <w:tcMar>
+              <w:top w:w="100" w:type="dxa"/>
+              <w:bottom w:w="100" w:type="dxa"/>
+              <w:left w:w="140" w:type="dxa"/>
+              <w:right w:w="140" w:type="dxa"/>
+            </w:tcMar>
+          </w:tcPr>
+          <w:p>
+            <w:r>
+              <w:rPr>
+                <w:rFonts w:ascii="Segoe UI" w:hAnsi="Segoe UI"/>
+                <w:b/>
+                <w:color w:val="1E293B"/>
+                <w:sz w:val="18"/>
+              </w:rPr>
+              <w:t>3. Field Responders</w:t>
+            </w:r>
+          </w:p>
+        </w:tc>
+        <w:tc>
+          <w:tcPr>
+            <w:tcW w:type="dxa" w:w="2880"/>
+            <w:shd w:val="clear" w:color="auto" w:fill="FFFFFF"/>
+            <w:tcMar>
+              <w:top w:w="100" w:type="dxa"/>
+              <w:bottom w:w="100" w:type="dxa"/>
+              <w:left w:w="140" w:type="dxa"/>
+              <w:right w:w="140" w:type="dxa"/>
+            </w:tcMar>
+          </w:tcPr>
+          <w:p>
+            <w:r>
+              <w:rPr>
+                <w:rFonts w:ascii="Segoe UI" w:hAnsi="Segoe UI"/>
+                <w:color w:val="1E293B"/>
+                <w:sz w:val="18"/>
+              </w:rPr>
+              <w:t>Mobile Web App, Offline Sync Queue</w:t>
+            </w:r>
+          </w:p>
+        </w:tc>
+        <w:tc>
+          <w:tcPr>
+            <w:tcW w:type="dxa" w:w="4320"/>
+            <w:shd w:val="clear" w:color="auto" w:fill="FFFFFF"/>
+            <w:tcMar>
+              <w:top w:w="100" w:type="dxa"/>
+              <w:bottom w:w="100" w:type="dxa"/>
+              <w:left w:w="140" w:type="dxa"/>
+              <w:right w:w="140" w:type="dxa"/>
+            </w:tcMar>
+          </w:tcPr>
+          <w:p>
+            <w:r>
+              <w:rPr>
+                <w:rFonts w:ascii="Segoe UI" w:hAnsi="Segoe UI"/>
+                <w:color w:val="1E293B"/>
+                <w:sz w:val="18"/>
+              </w:rPr>
+              <w:t>Ambulance, NDRF boat, or engineering squads who receive missions, update status, and operate even with zero cell service.</w:t>
+            </w:r>
+          </w:p>
+        </w:tc>
+      </w:tr>
+      <w:tr>
+        <w:tc>
+          <w:tcPr>
+            <w:tcW w:type="dxa" w:w="2160"/>
+            <w:shd w:val="clear" w:color="auto" w:fill="F8FAFC"/>
+            <w:tcMar>
+              <w:top w:w="100" w:type="dxa"/>
+              <w:bottom w:w="100" w:type="dxa"/>
+              <w:left w:w="140" w:type="dxa"/>
+              <w:right w:w="140" w:type="dxa"/>
+            </w:tcMar>
+          </w:tcPr>
+          <w:p>
+            <w:r>
+              <w:rPr>
+                <w:rFonts w:ascii="Segoe UI" w:hAnsi="Segoe UI"/>
+                <w:b/>
+                <w:color w:val="1E293B"/>
+                <w:sz w:val="18"/>
+              </w:rPr>
+              <w:t>4. Donors &amp; Volunteers</w:t>
+            </w:r>
+          </w:p>
+        </w:tc>
+        <w:tc>
+          <w:tcPr>
+            <w:tcW w:type="dxa" w:w="2880"/>
+            <w:shd w:val="clear" w:color="auto" w:fill="F8FAFC"/>
+            <w:tcMar>
+              <w:top w:w="100" w:type="dxa"/>
+              <w:bottom w:w="100" w:type="dxa"/>
+              <w:left w:w="140" w:type="dxa"/>
+              <w:right w:w="140" w:type="dxa"/>
+            </w:tcMar>
+          </w:tcPr>
+          <w:p>
+            <w:r>
+              <w:rPr>
+                <w:rFonts w:ascii="Segoe UI" w:hAnsi="Segoe UI"/>
+                <w:color w:val="1E293B"/>
+                <w:sz w:val="18"/>
+              </w:rPr>
+              <w:t>support.html, resource-center.html, missing-persons.html</w:t>
+            </w:r>
+          </w:p>
+        </w:tc>
+        <w:tc>
+          <w:tcPr>
+            <w:tcW w:type="dxa" w:w="4320"/>
+            <w:shd w:val="clear" w:color="auto" w:fill="F8FAFC"/>
+            <w:tcMar>
+              <w:top w:w="100" w:type="dxa"/>
+              <w:bottom w:w="100" w:type="dxa"/>
+              <w:left w:w="140" w:type="dxa"/>
+              <w:right w:w="140" w:type="dxa"/>
+            </w:tcMar>
+          </w:tcPr>
+          <w:p>
+            <w:r>
+              <w:rPr>
+                <w:rFonts w:ascii="Segoe UI" w:hAnsi="Segoe UI"/>
+                <w:color w:val="1E293B"/>
+                <w:sz w:val="18"/>
+              </w:rPr>
+              <w:t>Citizens and NGOs who donate funds/supplies, locate relief shelters, or search for displaced family.</w:t>
+            </w:r>
+          </w:p>
+        </w:tc>
+      </w:tr>
+    </w:tbl>
+    <w:p>
+      <w:pPr>
+        <w:spacing w:after="160"/>
+      </w:pPr>
+    </w:p>
+    <w:p>
+      <w:pPr>
+        <w:pStyle w:val="Heading2"/>
+      </w:pPr>
+      <w:r>
+        <w:t>2.2 Step-by-Step Incident Lifecycle (From Problem to Relief)</w:t>
+      </w:r>
+    </w:p>
+    <w:p>
+      <w:pPr>
+        <w:spacing w:after="60" w:line="276" w:lineRule="auto"/>
+      </w:pPr>
+      <w:r>
+        <w:rPr>
+          <w:b/>
+          <w:color w:val="0284C7"/>
+        </w:rPr>
+        <w:t xml:space="preserve">• Step 1: Incident Spotting: </w:t>
+      </w:r>
+      <w:r>
+        <w:t>Citizen discovers an earthen levee breach or road washout in Ward 7 and opens the mobile app.</w:t>
+      </w:r>
+    </w:p>
+    <w:p>
+      <w:pPr>
+        <w:spacing w:after="60" w:line="276" w:lineRule="auto"/>
+      </w:pPr>
+      <w:r>
+        <w:rPr>
+          <w:b/>
+          <w:color w:val="0284C7"/>
+        </w:rPr>
+        <w:t xml:space="preserve">• Step 2: Geotagged Capture: </w:t>
+      </w:r>
+      <w:r>
+        <w:t>Citizen snaps a photo and taps 'Detect GPS Pin' on report-problem.html, selecting category and headcount.</w:t>
+      </w:r>
+    </w:p>
+    <w:p>
+      <w:pPr>
+        <w:spacing w:after="60" w:line="276" w:lineRule="auto"/>
+      </w:pPr>
+      <w:r>
+        <w:rPr>
+          <w:b/>
+          <w:color w:val="0284C7"/>
+        </w:rPr>
+        <w:t xml:space="preserve">• Step 3: Instant AI Analysis: </w:t>
+      </w:r>
+      <w:r>
+        <w:t>Google Gemini AI analyzes structural damage within 2 seconds, evaluating water rise, electrical risk, and urgency score (0-100).</w:t>
+      </w:r>
+    </w:p>
+    <w:p>
+      <w:pPr>
+        <w:spacing w:after="60" w:line="276" w:lineRule="auto"/>
+      </w:pPr>
+      <w:r>
+        <w:rPr>
+          <w:b/>
+          <w:color w:val="0284C7"/>
+        </w:rPr>
+        <w:t xml:space="preserve">• Step 4: Spatial Duplicate Check: </w:t>
+      </w:r>
+      <w:r>
+        <w:t>Haversine engine checks if any neighbor reported the same flood within 500m / 24h, grouping duplicates to avoid EOC clutter.</w:t>
+      </w:r>
+    </w:p>
+    <w:p>
+      <w:pPr>
+        <w:spacing w:after="60" w:line="276" w:lineRule="auto"/>
+      </w:pPr>
+      <w:r>
+        <w:rPr>
+          <w:b/>
+          <w:color w:val="0284C7"/>
+        </w:rPr>
+        <w:t xml:space="preserve">• Step 5: EOC Officer Verification: </w:t>
+      </w:r>
+      <w:r>
+        <w:t>Disaster Director logs in to admin-dashboard.html via 6-digit OTP, sees high-priority P1 flag, and approves verification.</w:t>
+      </w:r>
+    </w:p>
+    <w:p>
+      <w:pPr>
+        <w:spacing w:after="60" w:line="276" w:lineRule="auto"/>
+      </w:pPr>
+      <w:r>
+        <w:rPr>
+          <w:b/>
+          <w:color w:val="0284C7"/>
+        </w:rPr>
+        <w:t xml:space="preserve">• Step 6: Top-3 Fleet Match: </w:t>
+      </w:r>
+      <w:r>
+        <w:t>System evaluates all available assets and recommends the 3 closest units with matching capabilities (e.g., NDRF Rescue Boat 04).</w:t>
+      </w:r>
+    </w:p>
+    <w:p>
+      <w:pPr>
+        <w:spacing w:after="60" w:line="276" w:lineRule="auto"/>
+      </w:pPr>
+      <w:r>
+        <w:rPr>
+          <w:b/>
+          <w:color w:val="0284C7"/>
+        </w:rPr>
+        <w:t xml:space="preserve">• Step 7: One-Click Dispatch: </w:t>
+      </w:r>
+      <w:r>
+        <w:t>Officer clicks 'Dispatch'. Resource is assigned, mission is created (MSN-101), and travel ETA is logged.</w:t>
+      </w:r>
+    </w:p>
+    <w:p>
+      <w:pPr>
+        <w:spacing w:after="60" w:line="276" w:lineRule="auto"/>
+      </w:pPr>
+      <w:r>
+        <w:rPr>
+          <w:b/>
+          <w:color w:val="0284C7"/>
+        </w:rPr>
+        <w:t xml:space="preserve">• Step 8: Field Action &amp; Offline Replay: </w:t>
+      </w:r>
+      <w:r>
+        <w:t>Boat squad receives task on phone. If cell towers fail, team records rescues locally; phone auto-syncs when signal returns.</w:t>
+      </w:r>
+    </w:p>
+    <w:p>
+      <w:pPr>
+        <w:spacing w:after="60" w:line="276" w:lineRule="auto"/>
+      </w:pPr>
+      <w:r>
+        <w:rPr>
+          <w:b/>
+          <w:color w:val="0284C7"/>
+        </w:rPr>
+        <w:t xml:space="preserve">• Step 9: Citizen Resolution Notice: </w:t>
+      </w:r>
+      <w:r>
+        <w:t>Citizen watches live progress bar on track.html (Logged -&gt; AI Evaluated -&gt; Responders En Route -&gt; Resolved).</w:t>
+      </w:r>
+    </w:p>
+    <w:p>
+      <w:pPr>
+        <w:spacing w:after="240"/>
+      </w:pPr>
+    </w:p>
+    <w:p>
+      <w:pPr>
+        <w:pStyle w:val="Heading1"/>
+      </w:pPr>
+      <w:r>
+        <w:t>3. Complete Project Directory Structure</w:t>
       </w:r>
     </w:p>
     <w:p>

</xml_diff>

<commit_message>
feat(dashboards): add stakeholder role routing, citizen dashboard, and field responder mission console
</commit_message>
<xml_diff>
--- a/docs/ChronicAI-Full-System-Documentation.docx
+++ b/docs/ChronicAI-Full-System-Documentation.docx
@@ -1832,7 +1832,7 @@
         <w:pStyle w:val="Heading2"/>
       </w:pPr>
       <w:r>
-        <w:t>login.html (Citizen &amp; Responder Sign-In)</w:t>
+        <w:t>login.html (Unified Login &amp; Role Gateway)</w:t>
       </w:r>
     </w:p>
     <w:p>
@@ -1856,7 +1856,7 @@
         <w:t xml:space="preserve">Target Persona: </w:t>
       </w:r>
       <w:r>
-        <w:t>Registered Citizens, Field Workers</w:t>
+        <w:t>Citizens, Emergency Officers, Field Responders</w:t>
         <w:br/>
       </w:r>
       <w:r>
@@ -1866,7 +1866,7 @@
         <w:t xml:space="preserve">Primary Purpose: </w:t>
       </w:r>
       <w:r>
-        <w:t>Secure authentication portal for citizens and field inspectors.</w:t>
+        <w:t>Stakeholder authentication gateway with role-based routing.</w:t>
         <w:br/>
       </w:r>
       <w:r>
@@ -1896,7 +1896,163 @@
         <w:t xml:space="preserve">Key Features: </w:t>
       </w:r>
       <w:r>
-        <w:t>Split-screen layout with photorealistic EOC command visual (auth-command-center.jpg), live district telemetry status pill, 1-click demo credential auto-fill (demo@localhost / LocalDemo123!), password reveal toggle, Google and GitHub OAuth buttons, and Day/Night mode styling.</w:t>
+        <w:t>Interactive 3-role selector (Citizen, EOC Officer, Field Unit), instant 1-click Demo buttons for all 3 roles, split-screen layout with photorealistic command visual, password reveal toggle, and automatic routing to role-specific dashboard.</w:t>
+        <w:br/>
+      </w:r>
+    </w:p>
+    <w:p>
+      <w:pPr>
+        <w:spacing w:after="80"/>
+      </w:pPr>
+    </w:p>
+    <w:p>
+      <w:pPr>
+        <w:pStyle w:val="Heading2"/>
+      </w:pPr>
+      <w:r>
+        <w:t>citizen-dashboard.html (Citizen Operations &amp; Lifeline Portal)</w:t>
+      </w:r>
+    </w:p>
+    <w:p>
+      <w:pPr>
+        <w:spacing w:line="276" w:lineRule="auto" w:after="80"/>
+      </w:pPr>
+      <w:r>
+        <w:rPr>
+          <w:b/>
+        </w:rPr>
+        <w:t xml:space="preserve">URL Route: </w:t>
+      </w:r>
+      <w:r>
+        <w:t>/citizen-dashboard or /citizen-dashboard.html</w:t>
+        <w:br/>
+      </w:r>
+      <w:r>
+        <w:rPr>
+          <w:b/>
+        </w:rPr>
+        <w:t xml:space="preserve">Target Persona: </w:t>
+      </w:r>
+      <w:r>
+        <w:t>Everyday Citizens, Disaster Victims, Residents</w:t>
+        <w:br/>
+      </w:r>
+      <w:r>
+        <w:rPr>
+          <w:b/>
+        </w:rPr>
+        <w:t xml:space="preserve">Primary Purpose: </w:t>
+      </w:r>
+      <w:r>
+        <w:t>Dedicated civilian cockpit for emergency reporting, tracking, and shelter access.</w:t>
+        <w:br/>
+      </w:r>
+      <w:r>
+        <w:rPr>
+          <w:b/>
+        </w:rPr>
+        <w:t xml:space="preserve">Client Scripts: </w:t>
+      </w:r>
+      <w:r>
+        <w:t>citizen-dashboard.js, theme-manager.js, auth-guard.js</w:t>
+        <w:br/>
+      </w:r>
+      <w:r>
+        <w:rPr>
+          <w:b/>
+        </w:rPr>
+        <w:t xml:space="preserve">APIs Consumed: </w:t>
+      </w:r>
+      <w:r>
+        <w:t>GET /api/reports, GET /api/incidents, GET /api/resources</w:t>
+        <w:br/>
+      </w:r>
+      <w:r>
+        <w:rPr>
+          <w:b/>
+        </w:rPr>
+        <w:t xml:space="preserve">Key Features: </w:t>
+      </w:r>
+      <w:r>
+        <w:t>EOC emergency flood alert banner, civilian safeNet greeting, 4-metric statistics strip (Reports, In Progress, Dispatched, Resolved), 4-card quick action strip (Report Hazard, SOS Rescue, Relief Shelters, Helplines), live incident dispatch tracker with ETA countdown, and 1-tap emergency helplines directory.</w:t>
+        <w:br/>
+      </w:r>
+    </w:p>
+    <w:p>
+      <w:pPr>
+        <w:spacing w:after="80"/>
+      </w:pPr>
+    </w:p>
+    <w:p>
+      <w:pPr>
+        <w:pStyle w:val="Heading2"/>
+      </w:pPr>
+      <w:r>
+        <w:t>responder-dashboard.html (Field Tactical Mission Console)</w:t>
+      </w:r>
+    </w:p>
+    <w:p>
+      <w:pPr>
+        <w:spacing w:line="276" w:lineRule="auto" w:after="80"/>
+      </w:pPr>
+      <w:r>
+        <w:rPr>
+          <w:b/>
+        </w:rPr>
+        <w:t xml:space="preserve">URL Route: </w:t>
+      </w:r>
+      <w:r>
+        <w:t>/responder-dashboard or /responder-dashboard.html</w:t>
+        <w:br/>
+      </w:r>
+      <w:r>
+        <w:rPr>
+          <w:b/>
+        </w:rPr>
+        <w:t xml:space="preserve">Target Persona: </w:t>
+      </w:r>
+      <w:r>
+        <w:t>NDRF Rescue Crews, Paramedics, Rapid Response Units</w:t>
+        <w:br/>
+      </w:r>
+      <w:r>
+        <w:rPr>
+          <w:b/>
+        </w:rPr>
+        <w:t xml:space="preserve">Primary Purpose: </w:t>
+      </w:r>
+      <w:r>
+        <w:t>High-contrast mobile-first tactical console for rescue boats, ambulances, and field crews.</w:t>
+        <w:br/>
+      </w:r>
+      <w:r>
+        <w:rPr>
+          <w:b/>
+        </w:rPr>
+        <w:t xml:space="preserve">Client Scripts: </w:t>
+      </w:r>
+      <w:r>
+        <w:t>responder-dashboard.js, theme-manager.js, auth-guard.js, field-offline-sync.js</w:t>
+        <w:br/>
+      </w:r>
+      <w:r>
+        <w:rPr>
+          <w:b/>
+        </w:rPr>
+        <w:t xml:space="preserve">APIs Consumed: </w:t>
+      </w:r>
+      <w:r>
+        <w:t>GET /api/missions, PATCH /api/missions/:id/status, POST /api/sync/push, GET /api/sync/road-closures</w:t>
+        <w:br/>
+      </w:r>
+      <w:r>
+        <w:rPr>
+          <w:b/>
+        </w:rPr>
+        <w:t xml:space="preserve">Key Features: </w:t>
+      </w:r>
+      <w:r>
+        <w:t>Unit callsign display (NDRF Unit 04), live telemetry strip (GPS fix, battery, mesh relay, offline queue), primary mission card with trapped civilian counts, 1-tap mission progression buttons (1. EN ROUTE -&gt; 2. ARRIVED -&gt; 3. EXTRACTING -&gt; 4. COMPLETED), road obstacle logger, and simulated offline storm mode with auto-batch synchronization.</w:t>
         <w:br/>
       </w:r>
     </w:p>

</xml_diff>